<commit_message>
docs: extend implementation report with member C results
</commit_message>
<xml_diff>
--- a/docs/implementation-report/第三部分软件实现报告.docx
+++ b/docs/implementation-report/第三部分软件实现报告.docx
@@ -27,7 +27,7 @@
           <w:rFonts w:ascii="宋体" w:hAnsi="宋体" w:eastAsia="宋体" w:cs="宋体"/>
           <w:color w:val="000000"/>
         </w:rPr>
-        <w:t>第三部分  成员A实现与协作交接</w:t>
+        <w:t>第三部分  成员A实现与成员C增量</w:t>
       </w:r>
     </w:p>
     <w:p>
@@ -41,7 +41,7 @@
           <w:sz w:val="21"/>
           <w:color w:val="000000"/>
         </w:rPr>
-        <w:t>编写日期  2026年10月28日    代码基线  c16e38e</w:t>
+        <w:t>更新日期  2026年10月29日    A基线 c16e38e    C基线 6112353</w:t>
       </w:r>
     </w:p>
     <w:p>
@@ -62,7 +62,7 @@
           <w:rFonts w:ascii="宋体" w:hAnsi="宋体" w:eastAsia="宋体" w:cs="宋体"/>
           <w:color w:val="000000"/>
         </w:rPr>
-        <w:t>本报告承接需求分析和软件设计，说明成员A如何将用户认证、商品发布检索、基础审核与隐私保护转化为可运行系统，并给出页面和测试证据。当前已完成独立演示闭环：登录、实名提交、管理员审核、商品发布、审核上架、检索详情、编辑重审及下架。</w:t>
+        <w:t>第一至八节及附录一保留A阶段实现与验收记录，第九至十四节及附录二补充C增量。A阶段完成用户认证、商品发布检索、基础审核与隐私保护，独立演示闭环包括登录、实名提交、管理员审核、商品发布、审核上架、检索详情、编辑重审及下架。</w:t>
       </w:r>
     </w:p>
     <w:p>
@@ -4043,11 +4043,1906 @@
         <w:pageBreakBefore/>
       </w:pPr>
       <w:r>
+        <w:t>九 C模块交付范围与数据实现</w:t>
+      </w:r>
+    </w:p>
+    <w:p>
+      <w:pPr/>
+      <w:r>
+        <w:t>成员C在A完整交付08471a9基础上，于feature/chat-reports分支完成咨询、收藏、举报及统一监管工作台，代码提交为6112353。本次增量新增3个页面，工程共11个页面；新增22个接口操作，与A原有20个操作共同形成42个已记录的接口。交易、支付、评价和正式信誉账本仍由B负责。</w:t>
+      </w:r>
+    </w:p>
+    <w:p>
+      <w:pPr>
+        <w:pStyle w:val="af7"/>
+        <w:keepNext/>
+      </w:pPr>
+      <w:r>
+        <w:t>表3-7 C模块数据结构与业务约束</w:t>
+      </w:r>
+    </w:p>
+    <w:tbl>
+      <w:tblPr>
+        <w:tblW w:type="auto" w:w="0"/>
+        <w:jc w:val="center"/>
+        <w:tblLayout w:type="fixed"/>
+        <w:tblLook w:firstColumn="1" w:firstRow="1" w:lastColumn="0" w:lastRow="0" w:noHBand="0" w:noVBand="1" w:val="04A0"/>
+        <w:tblBorders>
+          <w:top w:val="single" w:sz="4" w:color="D9D9D9"/>
+          <w:left w:val="single" w:sz="4" w:color="D9D9D9"/>
+          <w:bottom w:val="single" w:sz="4" w:color="D9D9D9"/>
+          <w:right w:val="single" w:sz="4" w:color="D9D9D9"/>
+          <w:insideH w:val="single" w:sz="4" w:color="D9D9D9"/>
+          <w:insideV w:val="single" w:sz="4" w:color="D9D9D9"/>
+        </w:tblBorders>
+        <w:tblCellMar>
+          <w:top w:w="90" w:type="dxa"/>
+          <w:bottom w:w="90" w:type="dxa"/>
+          <w:left w:w="90" w:type="dxa"/>
+          <w:right w:w="90" w:type="dxa"/>
+        </w:tblCellMar>
+      </w:tblPr>
+      <w:tblGrid>
+        <w:gridCol w:w="1984"/>
+        <w:gridCol w:w="3175"/>
+        <w:gridCol w:w="3912"/>
+      </w:tblGrid>
+      <w:tr>
+        <w:trPr>
+          <w:cantSplit/>
+          <w:tblHeader/>
+        </w:trPr>
+        <w:tc>
+          <w:tcPr>
+            <w:tcW w:type="dxa" w:w="1984"/>
+            <w:vAlign w:val="center"/>
+            <w:shd w:fill="F2F2F2"/>
+          </w:tcPr>
+          <w:p>
+            <w:pPr>
+              <w:spacing w:line="288" w:lineRule="auto" w:after="40" w:before="40"/>
+              <w:ind w:firstLine="0"/>
+              <w:jc w:val="center"/>
+            </w:pPr>
+            <w:r>
+              <w:rPr>
+                <w:rFonts w:ascii="宋体" w:hAnsi="宋体" w:eastAsia="宋体"/>
+                <w:b/>
+                <w:color w:val="000000"/>
+                <w:sz w:val="21"/>
+              </w:rPr>
+              <w:t>数据对象</w:t>
+            </w:r>
+          </w:p>
+        </w:tc>
+        <w:tc>
+          <w:tcPr>
+            <w:tcW w:type="dxa" w:w="3175"/>
+            <w:vAlign w:val="center"/>
+            <w:shd w:fill="F2F2F2"/>
+          </w:tcPr>
+          <w:p>
+            <w:pPr>
+              <w:spacing w:line="288" w:lineRule="auto" w:after="40" w:before="40"/>
+              <w:ind w:firstLine="0"/>
+              <w:jc w:val="center"/>
+            </w:pPr>
+            <w:r>
+              <w:rPr>
+                <w:rFonts w:ascii="宋体" w:hAnsi="宋体" w:eastAsia="宋体"/>
+                <w:b/>
+                <w:color w:val="000000"/>
+                <w:sz w:val="21"/>
+              </w:rPr>
+              <w:t>关键字段或约束</w:t>
+            </w:r>
+          </w:p>
+        </w:tc>
+        <w:tc>
+          <w:tcPr>
+            <w:tcW w:type="dxa" w:w="3912"/>
+            <w:vAlign w:val="center"/>
+            <w:shd w:fill="F2F2F2"/>
+          </w:tcPr>
+          <w:p>
+            <w:pPr>
+              <w:spacing w:line="288" w:lineRule="auto" w:after="40" w:before="40"/>
+              <w:ind w:firstLine="0"/>
+              <w:jc w:val="center"/>
+            </w:pPr>
+            <w:r>
+              <w:rPr>
+                <w:rFonts w:ascii="宋体" w:hAnsi="宋体" w:eastAsia="宋体"/>
+                <w:b/>
+                <w:color w:val="000000"/>
+                <w:sz w:val="21"/>
+              </w:rPr>
+              <w:t>实际用途</w:t>
+            </w:r>
+          </w:p>
+        </w:tc>
+      </w:tr>
+      <w:tr>
+        <w:trPr>
+          <w:cantSplit/>
+        </w:trPr>
+        <w:tc>
+          <w:tcPr>
+            <w:tcW w:type="dxa" w:w="1984"/>
+            <w:vAlign w:val="center"/>
+          </w:tcPr>
+          <w:p>
+            <w:pPr>
+              <w:spacing w:line="288" w:lineRule="auto" w:after="40" w:before="40"/>
+              <w:ind w:firstLine="0"/>
+              <w:jc w:val="center"/>
+            </w:pPr>
+            <w:r>
+              <w:rPr>
+                <w:rFonts w:ascii="宋体" w:hAnsi="宋体" w:eastAsia="宋体"/>
+                <w:b w:val="0"/>
+                <w:color w:val="000000"/>
+                <w:sz w:val="21"/>
+              </w:rPr>
+              <w:t>conversation</w:t>
+            </w:r>
+          </w:p>
+        </w:tc>
+        <w:tc>
+          <w:tcPr>
+            <w:tcW w:type="dxa" w:w="3175"/>
+            <w:vAlign w:val="center"/>
+          </w:tcPr>
+          <w:p>
+            <w:pPr>
+              <w:spacing w:line="288" w:lineRule="auto" w:after="40" w:before="40"/>
+              <w:ind w:firstLine="0"/>
+              <w:jc w:val="left"/>
+            </w:pPr>
+            <w:r>
+              <w:rPr>
+                <w:rFonts w:ascii="宋体" w:hAnsi="宋体" w:eastAsia="宋体"/>
+                <w:b w:val="0"/>
+                <w:color w:val="000000"/>
+                <w:sz w:val="21"/>
+              </w:rPr>
+              <w:t>商品、买家、卖家组合唯一</w:t>
+            </w:r>
+          </w:p>
+        </w:tc>
+        <w:tc>
+          <w:tcPr>
+            <w:tcW w:type="dxa" w:w="3912"/>
+            <w:vAlign w:val="center"/>
+          </w:tcPr>
+          <w:p>
+            <w:pPr>
+              <w:spacing w:line="288" w:lineRule="auto" w:after="40" w:before="40"/>
+              <w:ind w:firstLine="0"/>
+              <w:jc w:val="left"/>
+            </w:pPr>
+            <w:r>
+              <w:rPr>
+                <w:rFonts w:ascii="宋体" w:hAnsi="宋体" w:eastAsia="宋体"/>
+                <w:b w:val="0"/>
+                <w:color w:val="000000"/>
+                <w:sz w:val="21"/>
+              </w:rPr>
+              <w:t>同一咨询重复创建时复用会话</w:t>
+            </w:r>
+          </w:p>
+        </w:tc>
+      </w:tr>
+      <w:tr>
+        <w:trPr>
+          <w:cantSplit/>
+        </w:trPr>
+        <w:tc>
+          <w:tcPr>
+            <w:tcW w:type="dxa" w:w="1984"/>
+            <w:vAlign w:val="center"/>
+          </w:tcPr>
+          <w:p>
+            <w:pPr>
+              <w:spacing w:line="288" w:lineRule="auto" w:after="40" w:before="40"/>
+              <w:ind w:firstLine="0"/>
+              <w:jc w:val="center"/>
+            </w:pPr>
+            <w:r>
+              <w:rPr>
+                <w:rFonts w:ascii="宋体" w:hAnsi="宋体" w:eastAsia="宋体"/>
+                <w:b w:val="0"/>
+                <w:color w:val="000000"/>
+                <w:sz w:val="21"/>
+              </w:rPr>
+              <w:t>chat_message</w:t>
+            </w:r>
+          </w:p>
+        </w:tc>
+        <w:tc>
+          <w:tcPr>
+            <w:tcW w:type="dxa" w:w="3175"/>
+            <w:vAlign w:val="center"/>
+          </w:tcPr>
+          <w:p>
+            <w:pPr>
+              <w:spacing w:line="288" w:lineRule="auto" w:after="40" w:before="40"/>
+              <w:ind w:firstLine="0"/>
+              <w:jc w:val="left"/>
+            </w:pPr>
+            <w:r>
+              <w:rPr>
+                <w:rFonts w:ascii="宋体" w:hAnsi="宋体" w:eastAsia="宋体"/>
+                <w:b w:val="0"/>
+                <w:color w:val="000000"/>
+                <w:sz w:val="21"/>
+              </w:rPr>
+              <w:t>会话、发送者、客户端消息标识组合唯一</w:t>
+            </w:r>
+          </w:p>
+        </w:tc>
+        <w:tc>
+          <w:tcPr>
+            <w:tcW w:type="dxa" w:w="3912"/>
+            <w:vAlign w:val="center"/>
+          </w:tcPr>
+          <w:p>
+            <w:pPr>
+              <w:spacing w:line="288" w:lineRule="auto" w:after="40" w:before="40"/>
+              <w:ind w:firstLine="0"/>
+              <w:jc w:val="left"/>
+            </w:pPr>
+            <w:r>
+              <w:rPr>
+                <w:rFonts w:ascii="宋体" w:hAnsi="宋体" w:eastAsia="宋体"/>
+                <w:b w:val="0"/>
+                <w:color w:val="000000"/>
+                <w:sz w:val="21"/>
+              </w:rPr>
+              <w:t>重试不重复写入；按消息ID增量读取</w:t>
+            </w:r>
+          </w:p>
+        </w:tc>
+      </w:tr>
+      <w:tr>
+        <w:trPr>
+          <w:cantSplit/>
+        </w:trPr>
+        <w:tc>
+          <w:tcPr>
+            <w:tcW w:type="dxa" w:w="1984"/>
+            <w:vAlign w:val="center"/>
+          </w:tcPr>
+          <w:p>
+            <w:pPr>
+              <w:spacing w:line="288" w:lineRule="auto" w:after="40" w:before="40"/>
+              <w:ind w:firstLine="0"/>
+              <w:jc w:val="center"/>
+            </w:pPr>
+            <w:r>
+              <w:rPr>
+                <w:rFonts w:ascii="宋体" w:hAnsi="宋体" w:eastAsia="宋体"/>
+                <w:b w:val="0"/>
+                <w:color w:val="000000"/>
+                <w:sz w:val="21"/>
+              </w:rPr>
+              <w:t>favorite</w:t>
+            </w:r>
+          </w:p>
+        </w:tc>
+        <w:tc>
+          <w:tcPr>
+            <w:tcW w:type="dxa" w:w="3175"/>
+            <w:vAlign w:val="center"/>
+          </w:tcPr>
+          <w:p>
+            <w:pPr>
+              <w:spacing w:line="288" w:lineRule="auto" w:after="40" w:before="40"/>
+              <w:ind w:firstLine="0"/>
+              <w:jc w:val="left"/>
+            </w:pPr>
+            <w:r>
+              <w:rPr>
+                <w:rFonts w:ascii="宋体" w:hAnsi="宋体" w:eastAsia="宋体"/>
+                <w:b w:val="0"/>
+                <w:color w:val="000000"/>
+                <w:sz w:val="21"/>
+              </w:rPr>
+              <w:t>用户、商品组合主键</w:t>
+            </w:r>
+          </w:p>
+        </w:tc>
+        <w:tc>
+          <w:tcPr>
+            <w:tcW w:type="dxa" w:w="3912"/>
+            <w:vAlign w:val="center"/>
+          </w:tcPr>
+          <w:p>
+            <w:pPr>
+              <w:spacing w:line="288" w:lineRule="auto" w:after="40" w:before="40"/>
+              <w:ind w:firstLine="0"/>
+              <w:jc w:val="left"/>
+            </w:pPr>
+            <w:r>
+              <w:rPr>
+                <w:rFonts w:ascii="宋体" w:hAnsi="宋体" w:eastAsia="宋体"/>
+                <w:b w:val="0"/>
+                <w:color w:val="000000"/>
+                <w:sz w:val="21"/>
+              </w:rPr>
+              <w:t>收藏与取消幂等，按当前用户隔离</w:t>
+            </w:r>
+          </w:p>
+        </w:tc>
+      </w:tr>
+      <w:tr>
+        <w:trPr>
+          <w:cantSplit/>
+        </w:trPr>
+        <w:tc>
+          <w:tcPr>
+            <w:tcW w:type="dxa" w:w="1984"/>
+            <w:vAlign w:val="center"/>
+          </w:tcPr>
+          <w:p>
+            <w:pPr>
+              <w:spacing w:line="288" w:lineRule="auto" w:after="40" w:before="40"/>
+              <w:ind w:firstLine="0"/>
+              <w:jc w:val="center"/>
+            </w:pPr>
+            <w:r>
+              <w:rPr>
+                <w:rFonts w:ascii="宋体" w:hAnsi="宋体" w:eastAsia="宋体"/>
+                <w:b w:val="0"/>
+                <w:color w:val="000000"/>
+                <w:sz w:val="21"/>
+              </w:rPr>
+              <w:t>report</w:t>
+            </w:r>
+          </w:p>
+        </w:tc>
+        <w:tc>
+          <w:tcPr>
+            <w:tcW w:type="dxa" w:w="3175"/>
+            <w:vAlign w:val="center"/>
+          </w:tcPr>
+          <w:p>
+            <w:pPr>
+              <w:spacing w:line="288" w:lineRule="auto" w:after="40" w:before="40"/>
+              <w:ind w:firstLine="0"/>
+              <w:jc w:val="left"/>
+            </w:pPr>
+            <w:r>
+              <w:rPr>
+                <w:rFonts w:ascii="宋体" w:hAnsi="宋体" w:eastAsia="宋体"/>
+                <w:b w:val="0"/>
+                <w:color w:val="000000"/>
+                <w:sz w:val="21"/>
+              </w:rPr>
+              <w:t>举报人、对象、状态、处置及版本</w:t>
+            </w:r>
+          </w:p>
+        </w:tc>
+        <w:tc>
+          <w:tcPr>
+            <w:tcW w:type="dxa" w:w="3912"/>
+            <w:vAlign w:val="center"/>
+          </w:tcPr>
+          <w:p>
+            <w:pPr>
+              <w:spacing w:line="288" w:lineRule="auto" w:after="40" w:before="40"/>
+              <w:ind w:firstLine="0"/>
+              <w:jc w:val="left"/>
+            </w:pPr>
+            <w:r>
+              <w:rPr>
+                <w:rFonts w:ascii="宋体" w:hAnsi="宋体" w:eastAsia="宋体"/>
+                <w:b w:val="0"/>
+                <w:color w:val="000000"/>
+                <w:sz w:val="21"/>
+              </w:rPr>
+              <w:t>保存举报和结果，终态禁止重复处理</w:t>
+            </w:r>
+          </w:p>
+        </w:tc>
+      </w:tr>
+      <w:tr>
+        <w:trPr>
+          <w:cantSplit/>
+        </w:trPr>
+        <w:tc>
+          <w:tcPr>
+            <w:tcW w:type="dxa" w:w="1984"/>
+            <w:vAlign w:val="center"/>
+          </w:tcPr>
+          <w:p>
+            <w:pPr>
+              <w:spacing w:line="288" w:lineRule="auto" w:after="40" w:before="40"/>
+              <w:ind w:firstLine="0"/>
+              <w:jc w:val="center"/>
+            </w:pPr>
+            <w:r>
+              <w:rPr>
+                <w:rFonts w:ascii="宋体" w:hAnsi="宋体" w:eastAsia="宋体"/>
+                <w:b w:val="0"/>
+                <w:color w:val="000000"/>
+                <w:sz w:val="21"/>
+              </w:rPr>
+              <w:t>platform_rule</w:t>
+            </w:r>
+          </w:p>
+        </w:tc>
+        <w:tc>
+          <w:tcPr>
+            <w:tcW w:type="dxa" w:w="3175"/>
+            <w:vAlign w:val="center"/>
+          </w:tcPr>
+          <w:p>
+            <w:pPr>
+              <w:spacing w:line="288" w:lineRule="auto" w:after="40" w:before="40"/>
+              <w:ind w:firstLine="0"/>
+              <w:jc w:val="left"/>
+            </w:pPr>
+            <w:r>
+              <w:rPr>
+                <w:rFonts w:ascii="宋体" w:hAnsi="宋体" w:eastAsia="宋体"/>
+                <w:b w:val="0"/>
+                <w:color w:val="000000"/>
+                <w:sz w:val="21"/>
+              </w:rPr>
+              <w:t>规则名称主键、JSON值及版本</w:t>
+            </w:r>
+          </w:p>
+        </w:tc>
+        <w:tc>
+          <w:tcPr>
+            <w:tcW w:type="dxa" w:w="3912"/>
+            <w:vAlign w:val="center"/>
+          </w:tcPr>
+          <w:p>
+            <w:pPr>
+              <w:spacing w:line="288" w:lineRule="auto" w:after="40" w:before="40"/>
+              <w:ind w:firstLine="0"/>
+              <w:jc w:val="left"/>
+            </w:pPr>
+            <w:r>
+              <w:rPr>
+                <w:rFonts w:ascii="宋体" w:hAnsi="宋体" w:eastAsia="宋体"/>
+                <w:b w:val="0"/>
+                <w:color w:val="000000"/>
+                <w:sz w:val="21"/>
+              </w:rPr>
+              <w:t>管理关键词、频率和发布信誉门槛</w:t>
+            </w:r>
+          </w:p>
+        </w:tc>
+      </w:tr>
+      <w:tr>
+        <w:trPr>
+          <w:cantSplit/>
+        </w:trPr>
+        <w:tc>
+          <w:tcPr>
+            <w:tcW w:type="dxa" w:w="1984"/>
+            <w:vAlign w:val="center"/>
+          </w:tcPr>
+          <w:p>
+            <w:pPr>
+              <w:spacing w:line="288" w:lineRule="auto" w:after="40" w:before="40"/>
+              <w:ind w:firstLine="0"/>
+              <w:jc w:val="center"/>
+            </w:pPr>
+            <w:r>
+              <w:rPr>
+                <w:rFonts w:ascii="宋体" w:hAnsi="宋体" w:eastAsia="宋体"/>
+                <w:b w:val="0"/>
+                <w:color w:val="000000"/>
+                <w:sz w:val="21"/>
+              </w:rPr>
+              <w:t>product扩展</w:t>
+            </w:r>
+          </w:p>
+        </w:tc>
+        <w:tc>
+          <w:tcPr>
+            <w:tcW w:type="dxa" w:w="3175"/>
+            <w:vAlign w:val="center"/>
+          </w:tcPr>
+          <w:p>
+            <w:pPr>
+              <w:spacing w:line="288" w:lineRule="auto" w:after="40" w:before="40"/>
+              <w:ind w:firstLine="0"/>
+              <w:jc w:val="left"/>
+            </w:pPr>
+            <w:r>
+              <w:rPr>
+                <w:rFonts w:ascii="宋体" w:hAnsi="宋体" w:eastAsia="宋体"/>
+                <w:b w:val="0"/>
+                <w:color w:val="000000"/>
+                <w:sz w:val="21"/>
+              </w:rPr>
+              <w:t>moderation_frozen独立标志</w:t>
+            </w:r>
+          </w:p>
+        </w:tc>
+        <w:tc>
+          <w:tcPr>
+            <w:tcW w:type="dxa" w:w="3912"/>
+            <w:vAlign w:val="center"/>
+          </w:tcPr>
+          <w:p>
+            <w:pPr>
+              <w:spacing w:line="288" w:lineRule="auto" w:after="40" w:before="40"/>
+              <w:ind w:firstLine="0"/>
+              <w:jc w:val="left"/>
+            </w:pPr>
+            <w:r>
+              <w:rPr>
+                <w:rFonts w:ascii="宋体" w:hAnsi="宋体" w:eastAsia="宋体"/>
+                <w:b w:val="0"/>
+                <w:color w:val="000000"/>
+                <w:sz w:val="21"/>
+              </w:rPr>
+              <w:t>监管冻结与交易LOCKED状态并存</w:t>
+            </w:r>
+          </w:p>
+        </w:tc>
+      </w:tr>
+    </w:tbl>
+    <w:p>
+      <w:pPr/>
+      <w:r>
+        <w:t>新增迁移为004_c_community.sql，未修改已应用的001与002迁移；003编号预留给B。004不引用B的数据表，可独立应用。所有业务编号按字符串传输，金额沿用整数分，规则与业务数据保存在真实MySQL数据库中。</w:t>
+      </w:r>
+    </w:p>
+    <w:p>
+      <w:pPr/>
+      <w:r>
+        <w:t>页面入口分别为我的互动community、站内咨询chat和举报提交report；原admin页面整合为监管工作台。商品详情增加咨询、收藏、举报商品及举报卖家入口，“我的”增加咨询、收藏和举报结果入口。公共鉴权、统一响应和请求封装继续复用A的实现。</w:t>
+      </w:r>
+    </w:p>
+    <w:p>
+      <w:pPr>
+        <w:pStyle w:val="1"/>
+        <w:pageBreakBefore/>
+      </w:pPr>
+      <w:r>
+        <w:t>十 咨询消息与参与者隔离</w:t>
+      </w:r>
+    </w:p>
+    <w:p>
+      <w:pPr/>
+      <w:r>
+        <w:t>已登录用户可以就上架商品咨询卖家，未实名认证用户也可咨询；后端拒绝自聊、不可用商品和禁用账号。会话列表与每次消息读写均检查参与者身份，普通陌生人和非参与管理员不能通过会话接口读取消息。卖家和买家的其他会话相互隔离。</w:t>
+      </w:r>
+    </w:p>
+    <w:p>
+      <w:pPr/>
+      <w:r>
+        <w:t>消息正文限制为1至1000个Unicode字符，校验全角归一化后的联系方式、外链、引流话术及平台关键词。发送时按用户行锁统计跨会话频率，再锁定会话并写入消息；同一clientMessageId与同一正文的重试返回原消息，正文改变则返回409，避免消息被静默替换。</w:t>
+      </w:r>
+    </w:p>
+    <w:p>
+      <w:pPr>
+        <w:keepNext/>
+        <w:jc w:val="center"/>
+      </w:pPr>
+      <w:r>
+        <w:drawing>
+          <wp:inline xmlns:a="http://schemas.openxmlformats.org/drawingml/2006/main" xmlns:pic="http://schemas.openxmlformats.org/drawingml/2006/picture">
+            <wp:extent cx="5760000" cy="2496000"/>
+            <wp:docPr id="7" name="Picture 7" descr="图3-5 C咨询消息与增量轮询流程，依据代码绘制，非运行截图"/>
+            <wp:cNvGraphicFramePr>
+              <a:graphicFrameLocks noChangeAspect="1"/>
+            </wp:cNvGraphicFramePr>
+            <a:graphic>
+              <a:graphicData uri="http://schemas.openxmlformats.org/drawingml/2006/picture">
+                <pic:pic>
+                  <pic:nvPicPr>
+                    <pic:cNvPr id="0" name="07-c-chat-flow.png"/>
+                    <pic:cNvPicPr/>
+                  </pic:nvPicPr>
+                  <pic:blipFill>
+                    <a:blip r:embed="rId17"/>
+                    <a:stretch>
+                      <a:fillRect/>
+                    </a:stretch>
+                  </pic:blipFill>
+                  <pic:spPr>
+                    <a:xfrm>
+                      <a:off x="0" y="0"/>
+                      <a:ext cx="5760000" cy="2496000"/>
+                    </a:xfrm>
+                    <a:prstGeom prst="rect"/>
+                  </pic:spPr>
+                </pic:pic>
+              </a:graphicData>
+            </a:graphic>
+          </wp:inline>
+        </w:drawing>
+      </w:r>
+    </w:p>
+    <w:p>
+      <w:pPr>
+        <w:pStyle w:val="af7"/>
+        <w:jc w:val="center"/>
+      </w:pPr>
+      <w:r>
+        <w:t>图3-5 C咨询消息与增量轮询流程</w:t>
+      </w:r>
+    </w:p>
+    <w:p>
+      <w:pPr/>
+      <w:r>
+        <w:t>客户端每次最多读取50条消息，以字符串nextAfterId继续读取，避免bigint转换为数值后的精度丢失。服务端多取1条判断hasMore，有积压时立即续读，否则前台每3秒再次请求。页面隐藏或卸载时停止定时器，在途响应不再更新页面。</w:t>
+      </w:r>
+    </w:p>
+    <w:p>
+      <w:pPr/>
+      <w:r>
+        <w:t>网络失败后的发送重试保留原消息标识。发送成功响应不直接推进读取游标，下一轮仍按已读取位置取消息，避免跳过同时到达的对方回复。切换账号时清空旧消息与草稿。上述逻辑已通过页面行为及MySQL测试，图3-5为根据代码绘制的说明图，不是原生运行截图。</w:t>
+      </w:r>
+    </w:p>
+    <w:p>
+      <w:pPr>
+        <w:pStyle w:val="1"/>
+        <w:pageBreakBefore/>
+      </w:pPr>
+      <w:r>
+        <w:t>十一 收藏举报与凭证授权</w:t>
+      </w:r>
+    </w:p>
+    <w:p>
+      <w:pPr/>
+      <w:r>
+        <w:t>收藏接口以当前登录用户和商品的唯一键保存记录，重复收藏或取消只产生一次业务效果。列表保留已下架、冻结或卖家禁用的商品，并明确标记不可用；客户端不再跳转到其公开详情，用户仍可取消收藏。</w:t>
+      </w:r>
+    </w:p>
+    <w:p>
+      <w:pPr/>
+      <w:r>
+        <w:t>举报对象限商品或用户，后端使用当前登录身份作为举报人，禁止自举报及重复待处理工单。本人查询只返回自己的记录和处理结果，不能通过提交他人reporterId扩大范围。管理员可以开始调查、成立或驳回并关闭工单；调查和关闭需提交expectedVersion，陈旧列表返回409。</w:t>
+      </w:r>
+    </w:p>
+    <w:p>
+      <w:pPr>
+        <w:keepNext/>
+        <w:jc w:val="center"/>
+      </w:pPr>
+      <w:r>
+        <w:drawing>
+          <wp:inline xmlns:a="http://schemas.openxmlformats.org/drawingml/2006/main" xmlns:pic="http://schemas.openxmlformats.org/drawingml/2006/picture">
+            <wp:extent cx="5760000" cy="2880000"/>
+            <wp:docPr id="8" name="Picture 8" descr="图3-6 C举报处置与信誉事务流程，依据代码绘制，非运行截图"/>
+            <wp:cNvGraphicFramePr>
+              <a:graphicFrameLocks noChangeAspect="1"/>
+            </wp:cNvGraphicFramePr>
+            <a:graphic>
+              <a:graphicData uri="http://schemas.openxmlformats.org/drawingml/2006/picture">
+                <pic:pic>
+                  <pic:nvPicPr>
+                    <pic:cNvPr id="0" name="08-c-report-flow.png"/>
+                    <pic:cNvPicPr/>
+                  </pic:nvPicPr>
+                  <pic:blipFill>
+                    <a:blip r:embed="rId18"/>
+                    <a:stretch>
+                      <a:fillRect/>
+                    </a:stretch>
+                  </pic:blipFill>
+                  <pic:spPr>
+                    <a:xfrm>
+                      <a:off x="0" y="0"/>
+                      <a:ext cx="5760000" cy="2880000"/>
+                    </a:xfrm>
+                    <a:prstGeom prst="rect"/>
+                  </pic:spPr>
+                </pic:pic>
+              </a:graphicData>
+            </a:graphic>
+          </wp:inline>
+        </w:drawing>
+      </w:r>
+    </w:p>
+    <w:p>
+      <w:pPr>
+        <w:pStyle w:val="af7"/>
+        <w:jc w:val="center"/>
+      </w:pPr>
+      <w:r>
+        <w:t>图3-6 C举报处置与信誉事务流程</w:t>
+      </w:r>
+    </w:p>
+    <w:p>
+      <w:pPr/>
+      <w:r>
+        <w:t>管理员仅能在指定举报范围内查阅相关会话：会话双方必须为举报人与被举报人，商品举报还须匹配该商品。每次读取消息记录审计，不提供全体聊天公开查询。管理员不能处理或查阅与自己有关的工单。交易纠纷的凭证授权仍须等待B提供订单依据。</w:t>
+      </w:r>
+    </w:p>
+    <w:p>
+      <w:pPr/>
+      <w:r>
+        <w:t>成立举报时，在同一数据库连接内完成工单校验、信誉事件调用、商品或账号处置、工单结果及日志写入。重复处理返回409；任一步失败全部回滚。图3-6中的B信誉服务为待接入依赖，当前缺失时返回503，举报保持原状态，商品和分数均不改变。</w:t>
+      </w:r>
+    </w:p>
+    <w:p>
+      <w:pPr>
+        <w:pStyle w:val="1"/>
+        <w:pageBreakBefore/>
+      </w:pPr>
+      <w:r>
+        <w:t>十二 统一监管工作台与冻结保护</w:t>
+      </w:r>
+    </w:p>
+    <w:p>
+      <w:pPr/>
+      <w:r>
+        <w:t>监管工作台继续调用A的学生认证与商品审核接口，提交审核列表中看到的expectedVersion。冲突后刷新列表并保留失败提示，由管理员核对最新数据后重新操作，不能自动换用新版本批准。新增举报、账号、冻结、分类、规则与脱敏日志入口。</w:t>
+      </w:r>
+    </w:p>
+    <w:p>
+      <w:pPr>
+        <w:pStyle w:val="af7"/>
+        <w:keepNext/>
+      </w:pPr>
+      <w:r>
+        <w:t>表3-8 监管功能与服务端约束</w:t>
+      </w:r>
+    </w:p>
+    <w:tbl>
+      <w:tblPr>
+        <w:tblW w:type="auto" w:w="0"/>
+        <w:jc w:val="center"/>
+        <w:tblLayout w:type="fixed"/>
+        <w:tblLook w:firstColumn="1" w:firstRow="1" w:lastColumn="0" w:lastRow="0" w:noHBand="0" w:noVBand="1" w:val="04A0"/>
+        <w:tblBorders>
+          <w:top w:val="single" w:sz="4" w:color="D9D9D9"/>
+          <w:left w:val="single" w:sz="4" w:color="D9D9D9"/>
+          <w:bottom w:val="single" w:sz="4" w:color="D9D9D9"/>
+          <w:right w:val="single" w:sz="4" w:color="D9D9D9"/>
+          <w:insideH w:val="single" w:sz="4" w:color="D9D9D9"/>
+          <w:insideV w:val="single" w:sz="4" w:color="D9D9D9"/>
+        </w:tblBorders>
+        <w:tblCellMar>
+          <w:top w:w="90" w:type="dxa"/>
+          <w:bottom w:w="90" w:type="dxa"/>
+          <w:left w:w="90" w:type="dxa"/>
+          <w:right w:w="90" w:type="dxa"/>
+        </w:tblCellMar>
+      </w:tblPr>
+      <w:tblGrid>
+        <w:gridCol w:w="1984"/>
+        <w:gridCol w:w="3175"/>
+        <w:gridCol w:w="3912"/>
+      </w:tblGrid>
+      <w:tr>
+        <w:trPr>
+          <w:cantSplit/>
+          <w:tblHeader/>
+        </w:trPr>
+        <w:tc>
+          <w:tcPr>
+            <w:tcW w:type="dxa" w:w="1984"/>
+            <w:vAlign w:val="center"/>
+            <w:shd w:fill="F2F2F2"/>
+          </w:tcPr>
+          <w:p>
+            <w:pPr>
+              <w:spacing w:line="288" w:lineRule="auto" w:after="40" w:before="40"/>
+              <w:ind w:firstLine="0"/>
+              <w:jc w:val="center"/>
+            </w:pPr>
+            <w:r>
+              <w:rPr>
+                <w:rFonts w:ascii="宋体" w:hAnsi="宋体" w:eastAsia="宋体"/>
+                <w:b/>
+                <w:color w:val="000000"/>
+                <w:sz w:val="21"/>
+              </w:rPr>
+              <w:t>功能</w:t>
+            </w:r>
+          </w:p>
+        </w:tc>
+        <w:tc>
+          <w:tcPr>
+            <w:tcW w:type="dxa" w:w="3175"/>
+            <w:vAlign w:val="center"/>
+            <w:shd w:fill="F2F2F2"/>
+          </w:tcPr>
+          <w:p>
+            <w:pPr>
+              <w:spacing w:line="288" w:lineRule="auto" w:after="40" w:before="40"/>
+              <w:ind w:firstLine="0"/>
+              <w:jc w:val="center"/>
+            </w:pPr>
+            <w:r>
+              <w:rPr>
+                <w:rFonts w:ascii="宋体" w:hAnsi="宋体" w:eastAsia="宋体"/>
+                <w:b/>
+                <w:color w:val="000000"/>
+                <w:sz w:val="21"/>
+              </w:rPr>
+              <w:t>已实现行为</w:t>
+            </w:r>
+          </w:p>
+        </w:tc>
+        <w:tc>
+          <w:tcPr>
+            <w:tcW w:type="dxa" w:w="3912"/>
+            <w:vAlign w:val="center"/>
+            <w:shd w:fill="F2F2F2"/>
+          </w:tcPr>
+          <w:p>
+            <w:pPr>
+              <w:spacing w:line="288" w:lineRule="auto" w:after="40" w:before="40"/>
+              <w:ind w:firstLine="0"/>
+              <w:jc w:val="center"/>
+            </w:pPr>
+            <w:r>
+              <w:rPr>
+                <w:rFonts w:ascii="宋体" w:hAnsi="宋体" w:eastAsia="宋体"/>
+                <w:b/>
+                <w:color w:val="000000"/>
+                <w:sz w:val="21"/>
+              </w:rPr>
+              <w:t>权限或状态约束</w:t>
+            </w:r>
+          </w:p>
+        </w:tc>
+      </w:tr>
+      <w:tr>
+        <w:trPr>
+          <w:cantSplit/>
+        </w:trPr>
+        <w:tc>
+          <w:tcPr>
+            <w:tcW w:type="dxa" w:w="1984"/>
+            <w:vAlign w:val="center"/>
+          </w:tcPr>
+          <w:p>
+            <w:pPr>
+              <w:spacing w:line="288" w:lineRule="auto" w:after="40" w:before="40"/>
+              <w:ind w:firstLine="0"/>
+              <w:jc w:val="center"/>
+            </w:pPr>
+            <w:r>
+              <w:rPr>
+                <w:rFonts w:ascii="宋体" w:hAnsi="宋体" w:eastAsia="宋体"/>
+                <w:b w:val="0"/>
+                <w:color w:val="000000"/>
+                <w:sz w:val="21"/>
+              </w:rPr>
+              <w:t>账号管理</w:t>
+            </w:r>
+          </w:p>
+        </w:tc>
+        <w:tc>
+          <w:tcPr>
+            <w:tcW w:type="dxa" w:w="3175"/>
+            <w:vAlign w:val="center"/>
+          </w:tcPr>
+          <w:p>
+            <w:pPr>
+              <w:spacing w:line="288" w:lineRule="auto" w:after="40" w:before="40"/>
+              <w:ind w:firstLine="0"/>
+              <w:jc w:val="left"/>
+            </w:pPr>
+            <w:r>
+              <w:rPr>
+                <w:rFonts w:ascii="宋体" w:hAnsi="宋体" w:eastAsia="宋体"/>
+                <w:b w:val="0"/>
+                <w:color w:val="000000"/>
+                <w:sz w:val="21"/>
+              </w:rPr>
+              <w:t>禁用或恢复学生账号</w:t>
+            </w:r>
+          </w:p>
+        </w:tc>
+        <w:tc>
+          <w:tcPr>
+            <w:tcW w:type="dxa" w:w="3912"/>
+            <w:vAlign w:val="center"/>
+          </w:tcPr>
+          <w:p>
+            <w:pPr>
+              <w:spacing w:line="288" w:lineRule="auto" w:after="40" w:before="40"/>
+              <w:ind w:firstLine="0"/>
+              <w:jc w:val="left"/>
+            </w:pPr>
+            <w:r>
+              <w:rPr>
+                <w:rFonts w:ascii="宋体" w:hAnsi="宋体" w:eastAsia="宋体"/>
+                <w:b w:val="0"/>
+                <w:color w:val="000000"/>
+                <w:sz w:val="21"/>
+              </w:rPr>
+              <w:t>禁用删除登录会话；恢复须重新登录；禁止改role和信誉</w:t>
+            </w:r>
+          </w:p>
+        </w:tc>
+      </w:tr>
+      <w:tr>
+        <w:trPr>
+          <w:cantSplit/>
+        </w:trPr>
+        <w:tc>
+          <w:tcPr>
+            <w:tcW w:type="dxa" w:w="1984"/>
+            <w:vAlign w:val="center"/>
+          </w:tcPr>
+          <w:p>
+            <w:pPr>
+              <w:spacing w:line="288" w:lineRule="auto" w:after="40" w:before="40"/>
+              <w:ind w:firstLine="0"/>
+              <w:jc w:val="center"/>
+            </w:pPr>
+            <w:r>
+              <w:rPr>
+                <w:rFonts w:ascii="宋体" w:hAnsi="宋体" w:eastAsia="宋体"/>
+                <w:b w:val="0"/>
+                <w:color w:val="000000"/>
+                <w:sz w:val="21"/>
+              </w:rPr>
+              <w:t>冻结与解冻</w:t>
+            </w:r>
+          </w:p>
+        </w:tc>
+        <w:tc>
+          <w:tcPr>
+            <w:tcW w:type="dxa" w:w="3175"/>
+            <w:vAlign w:val="center"/>
+          </w:tcPr>
+          <w:p>
+            <w:pPr>
+              <w:spacing w:line="288" w:lineRule="auto" w:after="40" w:before="40"/>
+              <w:ind w:firstLine="0"/>
+              <w:jc w:val="left"/>
+            </w:pPr>
+            <w:r>
+              <w:rPr>
+                <w:rFonts w:ascii="宋体" w:hAnsi="宋体" w:eastAsia="宋体"/>
+                <w:b w:val="0"/>
+                <w:color w:val="000000"/>
+                <w:sz w:val="21"/>
+              </w:rPr>
+              <w:t>冻结商品或为LOCKED商品增加标志</w:t>
+            </w:r>
+          </w:p>
+        </w:tc>
+        <w:tc>
+          <w:tcPr>
+            <w:tcW w:type="dxa" w:w="3912"/>
+            <w:vAlign w:val="center"/>
+          </w:tcPr>
+          <w:p>
+            <w:pPr>
+              <w:spacing w:line="288" w:lineRule="auto" w:after="40" w:before="40"/>
+              <w:ind w:firstLine="0"/>
+              <w:jc w:val="left"/>
+            </w:pPr>
+            <w:r>
+              <w:rPr>
+                <w:rFonts w:ascii="宋体" w:hAnsi="宋体" w:eastAsia="宋体"/>
+                <w:b w:val="0"/>
+                <w:color w:val="000000"/>
+                <w:sz w:val="21"/>
+              </w:rPr>
+              <w:t>卖家编辑、重提和审核不能绕过；解冻不直接上架</w:t>
+            </w:r>
+          </w:p>
+        </w:tc>
+      </w:tr>
+      <w:tr>
+        <w:trPr>
+          <w:cantSplit/>
+        </w:trPr>
+        <w:tc>
+          <w:tcPr>
+            <w:tcW w:type="dxa" w:w="1984"/>
+            <w:vAlign w:val="center"/>
+          </w:tcPr>
+          <w:p>
+            <w:pPr>
+              <w:spacing w:line="288" w:lineRule="auto" w:after="40" w:before="40"/>
+              <w:ind w:firstLine="0"/>
+              <w:jc w:val="center"/>
+            </w:pPr>
+            <w:r>
+              <w:rPr>
+                <w:rFonts w:ascii="宋体" w:hAnsi="宋体" w:eastAsia="宋体"/>
+                <w:b w:val="0"/>
+                <w:color w:val="000000"/>
+                <w:sz w:val="21"/>
+              </w:rPr>
+              <w:t>分类维护</w:t>
+            </w:r>
+          </w:p>
+        </w:tc>
+        <w:tc>
+          <w:tcPr>
+            <w:tcW w:type="dxa" w:w="3175"/>
+            <w:vAlign w:val="center"/>
+          </w:tcPr>
+          <w:p>
+            <w:pPr>
+              <w:spacing w:line="288" w:lineRule="auto" w:after="40" w:before="40"/>
+              <w:ind w:firstLine="0"/>
+              <w:jc w:val="left"/>
+            </w:pPr>
+            <w:r>
+              <w:rPr>
+                <w:rFonts w:ascii="宋体" w:hAnsi="宋体" w:eastAsia="宋体"/>
+                <w:b w:val="0"/>
+                <w:color w:val="000000"/>
+                <w:sz w:val="21"/>
+              </w:rPr>
+              <w:t>新增、改名、启用及停用</w:t>
+            </w:r>
+          </w:p>
+        </w:tc>
+        <w:tc>
+          <w:tcPr>
+            <w:tcW w:type="dxa" w:w="3912"/>
+            <w:vAlign w:val="center"/>
+          </w:tcPr>
+          <w:p>
+            <w:pPr>
+              <w:spacing w:line="288" w:lineRule="auto" w:after="40" w:before="40"/>
+              <w:ind w:firstLine="0"/>
+              <w:jc w:val="left"/>
+            </w:pPr>
+            <w:r>
+              <w:rPr>
+                <w:rFonts w:ascii="宋体" w:hAnsi="宋体" w:eastAsia="宋体"/>
+                <w:b w:val="0"/>
+                <w:color w:val="000000"/>
+                <w:sz w:val="21"/>
+              </w:rPr>
+              <w:t>保留已引用分类和商品，不物理删除分类</w:t>
+            </w:r>
+          </w:p>
+        </w:tc>
+      </w:tr>
+      <w:tr>
+        <w:trPr>
+          <w:cantSplit/>
+        </w:trPr>
+        <w:tc>
+          <w:tcPr>
+            <w:tcW w:type="dxa" w:w="1984"/>
+            <w:vAlign w:val="center"/>
+          </w:tcPr>
+          <w:p>
+            <w:pPr>
+              <w:spacing w:line="288" w:lineRule="auto" w:after="40" w:before="40"/>
+              <w:ind w:firstLine="0"/>
+              <w:jc w:val="center"/>
+            </w:pPr>
+            <w:r>
+              <w:rPr>
+                <w:rFonts w:ascii="宋体" w:hAnsi="宋体" w:eastAsia="宋体"/>
+                <w:b w:val="0"/>
+                <w:color w:val="000000"/>
+                <w:sz w:val="21"/>
+              </w:rPr>
+              <w:t>平台规则</w:t>
+            </w:r>
+          </w:p>
+        </w:tc>
+        <w:tc>
+          <w:tcPr>
+            <w:tcW w:type="dxa" w:w="3175"/>
+            <w:vAlign w:val="center"/>
+          </w:tcPr>
+          <w:p>
+            <w:pPr>
+              <w:spacing w:line="288" w:lineRule="auto" w:after="40" w:before="40"/>
+              <w:ind w:firstLine="0"/>
+              <w:jc w:val="left"/>
+            </w:pPr>
+            <w:r>
+              <w:rPr>
+                <w:rFonts w:ascii="宋体" w:hAnsi="宋体" w:eastAsia="宋体"/>
+                <w:b w:val="0"/>
+                <w:color w:val="000000"/>
+                <w:sz w:val="21"/>
+              </w:rPr>
+              <w:t>关键词、三类频率及发布信誉门槛</w:t>
+            </w:r>
+          </w:p>
+        </w:tc>
+        <w:tc>
+          <w:tcPr>
+            <w:tcW w:type="dxa" w:w="3912"/>
+            <w:vAlign w:val="center"/>
+          </w:tcPr>
+          <w:p>
+            <w:pPr>
+              <w:spacing w:line="288" w:lineRule="auto" w:after="40" w:before="40"/>
+              <w:ind w:firstLine="0"/>
+              <w:jc w:val="left"/>
+            </w:pPr>
+            <w:r>
+              <w:rPr>
+                <w:rFonts w:ascii="宋体" w:hAnsi="宋体" w:eastAsia="宋体"/>
+                <w:b w:val="0"/>
+                <w:color w:val="000000"/>
+                <w:sz w:val="21"/>
+              </w:rPr>
+              <w:t>仅白名单键，校验数值范围与版本</w:t>
+            </w:r>
+          </w:p>
+        </w:tc>
+      </w:tr>
+      <w:tr>
+        <w:trPr>
+          <w:cantSplit/>
+        </w:trPr>
+        <w:tc>
+          <w:tcPr>
+            <w:tcW w:type="dxa" w:w="1984"/>
+            <w:vAlign w:val="center"/>
+          </w:tcPr>
+          <w:p>
+            <w:pPr>
+              <w:spacing w:line="288" w:lineRule="auto" w:after="40" w:before="40"/>
+              <w:ind w:firstLine="0"/>
+              <w:jc w:val="center"/>
+            </w:pPr>
+            <w:r>
+              <w:rPr>
+                <w:rFonts w:ascii="宋体" w:hAnsi="宋体" w:eastAsia="宋体"/>
+                <w:b w:val="0"/>
+                <w:color w:val="000000"/>
+                <w:sz w:val="21"/>
+              </w:rPr>
+              <w:t>操作日志</w:t>
+            </w:r>
+          </w:p>
+        </w:tc>
+        <w:tc>
+          <w:tcPr>
+            <w:tcW w:type="dxa" w:w="3175"/>
+            <w:vAlign w:val="center"/>
+          </w:tcPr>
+          <w:p>
+            <w:pPr>
+              <w:spacing w:line="288" w:lineRule="auto" w:after="40" w:before="40"/>
+              <w:ind w:firstLine="0"/>
+              <w:jc w:val="left"/>
+            </w:pPr>
+            <w:r>
+              <w:rPr>
+                <w:rFonts w:ascii="宋体" w:hAnsi="宋体" w:eastAsia="宋体"/>
+                <w:b w:val="0"/>
+                <w:color w:val="000000"/>
+                <w:sz w:val="21"/>
+              </w:rPr>
+              <w:t>管理员分页查询固定字段</w:t>
+            </w:r>
+          </w:p>
+        </w:tc>
+        <w:tc>
+          <w:tcPr>
+            <w:tcW w:type="dxa" w:w="3912"/>
+            <w:vAlign w:val="center"/>
+          </w:tcPr>
+          <w:p>
+            <w:pPr>
+              <w:spacing w:line="288" w:lineRule="auto" w:after="40" w:before="40"/>
+              <w:ind w:firstLine="0"/>
+              <w:jc w:val="left"/>
+            </w:pPr>
+            <w:r>
+              <w:rPr>
+                <w:rFonts w:ascii="宋体" w:hAnsi="宋体" w:eastAsia="宋体"/>
+                <w:b w:val="0"/>
+                <w:color w:val="000000"/>
+                <w:sz w:val="21"/>
+              </w:rPr>
+              <w:t>不返回可能含身份原文的details</w:t>
+            </w:r>
+          </w:p>
+        </w:tc>
+      </w:tr>
+    </w:tbl>
+    <w:p>
+      <w:pPr/>
+      <w:r>
+        <w:t>监管冻结使用独立的moderation_frozen字段。对非交易锁定商品，冻结后状态为FROZEN；对LOCKED商品，保留订单锁定状态并设置冻结标志。管理员解冻只清除监管标志，FROZEN转为OFF_SHELF，LOCKED仍保持LOCKED。该设计使监管决定不会释放交易锁。</w:t>
+      </w:r>
+    </w:p>
+    <w:p>
+      <w:pPr/>
+      <w:r>
+        <w:t>平台默认每分钟消息30条、举报5次、发布5件，发布最低信誉60；管理端变更后按数据库规则生效。A商品保存和发布资格检查已接入这些规则。独立账号管理不替代成立举报的扣分事务，B未接入时不能借账号接口将待处理举报伪记为处理完成。</w:t>
+      </w:r>
+    </w:p>
+    <w:p>
+      <w:pPr>
+        <w:pStyle w:val="1"/>
+        <w:pageBreakBefore/>
+      </w:pPr>
+      <w:r>
+        <w:t>十三 C模块验证结果与验收边界</w:t>
+      </w:r>
+    </w:p>
+    <w:p>
+      <w:pPr/>
+      <w:r>
+        <w:t>本次验证环境为Windows PowerShell 5、Node 24.19.0和MySQL 8.4.13。集成测试严格使用DB_NAME加_test命名的独立数据库，与演示库隔离。以下是2026年10月29日C提交的本地验证结果，不沿用A原生截图和CI记录作为C新增功能的验收证据。</w:t>
+      </w:r>
+    </w:p>
+    <w:p>
+      <w:pPr>
+        <w:pStyle w:val="af7"/>
+        <w:keepNext/>
+      </w:pPr>
+      <w:r>
+        <w:t>表3-9 C增量与A回归验证结果</w:t>
+      </w:r>
+    </w:p>
+    <w:tbl>
+      <w:tblPr>
+        <w:tblW w:type="auto" w:w="0"/>
+        <w:jc w:val="center"/>
+        <w:tblLayout w:type="fixed"/>
+        <w:tblLook w:firstColumn="1" w:firstRow="1" w:lastColumn="0" w:lastRow="0" w:noHBand="0" w:noVBand="1" w:val="04A0"/>
+        <w:tblBorders>
+          <w:top w:val="single" w:sz="4" w:color="D9D9D9"/>
+          <w:left w:val="single" w:sz="4" w:color="D9D9D9"/>
+          <w:bottom w:val="single" w:sz="4" w:color="D9D9D9"/>
+          <w:right w:val="single" w:sz="4" w:color="D9D9D9"/>
+          <w:insideH w:val="single" w:sz="4" w:color="D9D9D9"/>
+          <w:insideV w:val="single" w:sz="4" w:color="D9D9D9"/>
+        </w:tblBorders>
+        <w:tblCellMar>
+          <w:top w:w="90" w:type="dxa"/>
+          <w:bottom w:w="90" w:type="dxa"/>
+          <w:left w:w="90" w:type="dxa"/>
+          <w:right w:w="90" w:type="dxa"/>
+        </w:tblCellMar>
+      </w:tblPr>
+      <w:tblGrid>
+        <w:gridCol w:w="1984"/>
+        <w:gridCol w:w="3175"/>
+        <w:gridCol w:w="3912"/>
+      </w:tblGrid>
+      <w:tr>
+        <w:trPr>
+          <w:cantSplit/>
+          <w:tblHeader/>
+        </w:trPr>
+        <w:tc>
+          <w:tcPr>
+            <w:tcW w:type="dxa" w:w="1984"/>
+            <w:vAlign w:val="center"/>
+            <w:shd w:fill="F2F2F2"/>
+          </w:tcPr>
+          <w:p>
+            <w:pPr>
+              <w:spacing w:line="288" w:lineRule="auto" w:after="40" w:before="40"/>
+              <w:ind w:firstLine="0"/>
+              <w:jc w:val="center"/>
+            </w:pPr>
+            <w:r>
+              <w:rPr>
+                <w:rFonts w:ascii="宋体" w:hAnsi="宋体" w:eastAsia="宋体"/>
+                <w:b/>
+                <w:color w:val="000000"/>
+                <w:sz w:val="21"/>
+              </w:rPr>
+              <w:t>检查项目</w:t>
+            </w:r>
+          </w:p>
+        </w:tc>
+        <w:tc>
+          <w:tcPr>
+            <w:tcW w:type="dxa" w:w="3175"/>
+            <w:vAlign w:val="center"/>
+            <w:shd w:fill="F2F2F2"/>
+          </w:tcPr>
+          <w:p>
+            <w:pPr>
+              <w:spacing w:line="288" w:lineRule="auto" w:after="40" w:before="40"/>
+              <w:ind w:firstLine="0"/>
+              <w:jc w:val="center"/>
+            </w:pPr>
+            <w:r>
+              <w:rPr>
+                <w:rFonts w:ascii="宋体" w:hAnsi="宋体" w:eastAsia="宋体"/>
+                <w:b/>
+                <w:color w:val="000000"/>
+                <w:sz w:val="21"/>
+              </w:rPr>
+              <w:t>本次结果</w:t>
+            </w:r>
+          </w:p>
+        </w:tc>
+        <w:tc>
+          <w:tcPr>
+            <w:tcW w:type="dxa" w:w="3912"/>
+            <w:vAlign w:val="center"/>
+            <w:shd w:fill="F2F2F2"/>
+          </w:tcPr>
+          <w:p>
+            <w:pPr>
+              <w:spacing w:line="288" w:lineRule="auto" w:after="40" w:before="40"/>
+              <w:ind w:firstLine="0"/>
+              <w:jc w:val="center"/>
+            </w:pPr>
+            <w:r>
+              <w:rPr>
+                <w:rFonts w:ascii="宋体" w:hAnsi="宋体" w:eastAsia="宋体"/>
+                <w:b/>
+                <w:color w:val="000000"/>
+                <w:sz w:val="21"/>
+              </w:rPr>
+              <w:t>证据与范围</w:t>
+            </w:r>
+          </w:p>
+        </w:tc>
+      </w:tr>
+      <w:tr>
+        <w:trPr>
+          <w:cantSplit/>
+        </w:trPr>
+        <w:tc>
+          <w:tcPr>
+            <w:tcW w:type="dxa" w:w="1984"/>
+            <w:vAlign w:val="center"/>
+          </w:tcPr>
+          <w:p>
+            <w:pPr>
+              <w:spacing w:line="288" w:lineRule="auto" w:after="40" w:before="40"/>
+              <w:ind w:firstLine="0"/>
+              <w:jc w:val="center"/>
+            </w:pPr>
+            <w:r>
+              <w:rPr>
+                <w:rFonts w:ascii="宋体" w:hAnsi="宋体" w:eastAsia="宋体"/>
+                <w:b w:val="0"/>
+                <w:color w:val="000000"/>
+                <w:sz w:val="21"/>
+              </w:rPr>
+              <w:t>类型 构建 契约 静态页面</w:t>
+            </w:r>
+          </w:p>
+        </w:tc>
+        <w:tc>
+          <w:tcPr>
+            <w:tcW w:type="dxa" w:w="3175"/>
+            <w:vAlign w:val="center"/>
+          </w:tcPr>
+          <w:p>
+            <w:pPr>
+              <w:spacing w:line="288" w:lineRule="auto" w:after="40" w:before="40"/>
+              <w:ind w:firstLine="0"/>
+              <w:jc w:val="left"/>
+            </w:pPr>
+            <w:r>
+              <w:rPr>
+                <w:rFonts w:ascii="宋体" w:hAnsi="宋体" w:eastAsia="宋体"/>
+                <w:b w:val="0"/>
+                <w:color w:val="000000"/>
+                <w:sz w:val="21"/>
+              </w:rPr>
+              <w:t>通过</w:t>
+            </w:r>
+          </w:p>
+        </w:tc>
+        <w:tc>
+          <w:tcPr>
+            <w:tcW w:type="dxa" w:w="3912"/>
+            <w:vAlign w:val="center"/>
+          </w:tcPr>
+          <w:p>
+            <w:pPr>
+              <w:spacing w:line="288" w:lineRule="auto" w:after="40" w:before="40"/>
+              <w:ind w:firstLine="0"/>
+              <w:jc w:val="left"/>
+            </w:pPr>
+            <w:r>
+              <w:rPr>
+                <w:rFonts w:ascii="宋体" w:hAnsi="宋体" w:eastAsia="宋体"/>
+                <w:b w:val="0"/>
+                <w:color w:val="000000"/>
+                <w:sz w:val="21"/>
+              </w:rPr>
+              <w:t>11个页面、42个操作；不等于原生编译</w:t>
+            </w:r>
+          </w:p>
+        </w:tc>
+      </w:tr>
+      <w:tr>
+        <w:trPr>
+          <w:cantSplit/>
+        </w:trPr>
+        <w:tc>
+          <w:tcPr>
+            <w:tcW w:type="dxa" w:w="1984"/>
+            <w:vAlign w:val="center"/>
+          </w:tcPr>
+          <w:p>
+            <w:pPr>
+              <w:spacing w:line="288" w:lineRule="auto" w:after="40" w:before="40"/>
+              <w:ind w:firstLine="0"/>
+              <w:jc w:val="center"/>
+            </w:pPr>
+            <w:r>
+              <w:rPr>
+                <w:rFonts w:ascii="宋体" w:hAnsi="宋体" w:eastAsia="宋体"/>
+                <w:b w:val="0"/>
+                <w:color w:val="000000"/>
+                <w:sz w:val="21"/>
+              </w:rPr>
+              <w:t>单元及页面行为</w:t>
+            </w:r>
+          </w:p>
+        </w:tc>
+        <w:tc>
+          <w:tcPr>
+            <w:tcW w:type="dxa" w:w="3175"/>
+            <w:vAlign w:val="center"/>
+          </w:tcPr>
+          <w:p>
+            <w:pPr>
+              <w:spacing w:line="288" w:lineRule="auto" w:after="40" w:before="40"/>
+              <w:ind w:firstLine="0"/>
+              <w:jc w:val="left"/>
+            </w:pPr>
+            <w:r>
+              <w:rPr>
+                <w:rFonts w:ascii="宋体" w:hAnsi="宋体" w:eastAsia="宋体"/>
+                <w:b w:val="0"/>
+                <w:color w:val="000000"/>
+                <w:sz w:val="21"/>
+              </w:rPr>
+              <w:t>20项通过</w:t>
+            </w:r>
+          </w:p>
+        </w:tc>
+        <w:tc>
+          <w:tcPr>
+            <w:tcW w:type="dxa" w:w="3912"/>
+            <w:vAlign w:val="center"/>
+          </w:tcPr>
+          <w:p>
+            <w:pPr>
+              <w:spacing w:line="288" w:lineRule="auto" w:after="40" w:before="40"/>
+              <w:ind w:firstLine="0"/>
+              <w:jc w:val="left"/>
+            </w:pPr>
+            <w:r>
+              <w:rPr>
+                <w:rFonts w:ascii="宋体" w:hAnsi="宋体" w:eastAsia="宋体"/>
+                <w:b w:val="0"/>
+                <w:color w:val="000000"/>
+                <w:sz w:val="21"/>
+              </w:rPr>
+              <w:t>A原有13项加C新增7项</w:t>
+            </w:r>
+          </w:p>
+        </w:tc>
+      </w:tr>
+      <w:tr>
+        <w:trPr>
+          <w:cantSplit/>
+        </w:trPr>
+        <w:tc>
+          <w:tcPr>
+            <w:tcW w:type="dxa" w:w="1984"/>
+            <w:vAlign w:val="center"/>
+          </w:tcPr>
+          <w:p>
+            <w:pPr>
+              <w:spacing w:line="288" w:lineRule="auto" w:after="40" w:before="40"/>
+              <w:ind w:firstLine="0"/>
+              <w:jc w:val="center"/>
+            </w:pPr>
+            <w:r>
+              <w:rPr>
+                <w:rFonts w:ascii="宋体" w:hAnsi="宋体" w:eastAsia="宋体"/>
+                <w:b w:val="0"/>
+                <w:color w:val="000000"/>
+                <w:sz w:val="21"/>
+              </w:rPr>
+              <w:t>真实MySQL集成</w:t>
+            </w:r>
+          </w:p>
+        </w:tc>
+        <w:tc>
+          <w:tcPr>
+            <w:tcW w:type="dxa" w:w="3175"/>
+            <w:vAlign w:val="center"/>
+          </w:tcPr>
+          <w:p>
+            <w:pPr>
+              <w:spacing w:line="288" w:lineRule="auto" w:after="40" w:before="40"/>
+              <w:ind w:firstLine="0"/>
+              <w:jc w:val="left"/>
+            </w:pPr>
+            <w:r>
+              <w:rPr>
+                <w:rFonts w:ascii="宋体" w:hAnsi="宋体" w:eastAsia="宋体"/>
+                <w:b w:val="0"/>
+                <w:color w:val="000000"/>
+                <w:sz w:val="21"/>
+              </w:rPr>
+              <w:t>20组通过</w:t>
+            </w:r>
+          </w:p>
+        </w:tc>
+        <w:tc>
+          <w:tcPr>
+            <w:tcW w:type="dxa" w:w="3912"/>
+            <w:vAlign w:val="center"/>
+          </w:tcPr>
+          <w:p>
+            <w:pPr>
+              <w:spacing w:line="288" w:lineRule="auto" w:after="40" w:before="40"/>
+              <w:ind w:firstLine="0"/>
+              <w:jc w:val="left"/>
+            </w:pPr>
+            <w:r>
+              <w:rPr>
+                <w:rFonts w:ascii="宋体" w:hAnsi="宋体" w:eastAsia="宋体"/>
+                <w:b w:val="0"/>
+                <w:color w:val="000000"/>
+                <w:sz w:val="21"/>
+              </w:rPr>
+              <w:t>A回归9组加C专项11组</w:t>
+            </w:r>
+          </w:p>
+        </w:tc>
+      </w:tr>
+      <w:tr>
+        <w:trPr>
+          <w:cantSplit/>
+        </w:trPr>
+        <w:tc>
+          <w:tcPr>
+            <w:tcW w:type="dxa" w:w="1984"/>
+            <w:vAlign w:val="center"/>
+          </w:tcPr>
+          <w:p>
+            <w:pPr>
+              <w:spacing w:line="288" w:lineRule="auto" w:after="40" w:before="40"/>
+              <w:ind w:firstLine="0"/>
+              <w:jc w:val="center"/>
+            </w:pPr>
+            <w:r>
+              <w:rPr>
+                <w:rFonts w:ascii="宋体" w:hAnsi="宋体" w:eastAsia="宋体"/>
+                <w:b w:val="0"/>
+                <w:color w:val="000000"/>
+                <w:sz w:val="21"/>
+              </w:rPr>
+              <w:t>100并发商品检索</w:t>
+            </w:r>
+          </w:p>
+        </w:tc>
+        <w:tc>
+          <w:tcPr>
+            <w:tcW w:type="dxa" w:w="3175"/>
+            <w:vAlign w:val="center"/>
+          </w:tcPr>
+          <w:p>
+            <w:pPr>
+              <w:spacing w:line="288" w:lineRule="auto" w:after="40" w:before="40"/>
+              <w:ind w:firstLine="0"/>
+              <w:jc w:val="left"/>
+            </w:pPr>
+            <w:r>
+              <w:rPr>
+                <w:rFonts w:ascii="宋体" w:hAnsi="宋体" w:eastAsia="宋体"/>
+                <w:b w:val="0"/>
+                <w:color w:val="000000"/>
+                <w:sz w:val="21"/>
+              </w:rPr>
+              <w:t>100次成功</w:t>
+            </w:r>
+          </w:p>
+        </w:tc>
+        <w:tc>
+          <w:tcPr>
+            <w:tcW w:type="dxa" w:w="3912"/>
+            <w:vAlign w:val="center"/>
+          </w:tcPr>
+          <w:p>
+            <w:pPr>
+              <w:spacing w:line="288" w:lineRule="auto" w:after="40" w:before="40"/>
+              <w:ind w:firstLine="0"/>
+              <w:jc w:val="left"/>
+            </w:pPr>
+            <w:r>
+              <w:rPr>
+                <w:rFonts w:ascii="宋体" w:hAnsi="宋体" w:eastAsia="宋体"/>
+                <w:b w:val="0"/>
+                <w:color w:val="000000"/>
+                <w:sz w:val="21"/>
+              </w:rPr>
+              <w:t>212件商品，p95为194.70ms，目标不超过2000ms</w:t>
+            </w:r>
+          </w:p>
+        </w:tc>
+      </w:tr>
+      <w:tr>
+        <w:trPr>
+          <w:cantSplit/>
+        </w:trPr>
+        <w:tc>
+          <w:tcPr>
+            <w:tcW w:type="dxa" w:w="1984"/>
+            <w:vAlign w:val="center"/>
+          </w:tcPr>
+          <w:p>
+            <w:pPr>
+              <w:spacing w:line="288" w:lineRule="auto" w:after="40" w:before="40"/>
+              <w:ind w:firstLine="0"/>
+              <w:jc w:val="center"/>
+            </w:pPr>
+            <w:r>
+              <w:rPr>
+                <w:rFonts w:ascii="宋体" w:hAnsi="宋体" w:eastAsia="宋体"/>
+                <w:b w:val="0"/>
+                <w:color w:val="000000"/>
+                <w:sz w:val="21"/>
+              </w:rPr>
+              <w:t>B正式信誉和订单联调</w:t>
+            </w:r>
+          </w:p>
+        </w:tc>
+        <w:tc>
+          <w:tcPr>
+            <w:tcW w:type="dxa" w:w="3175"/>
+            <w:vAlign w:val="center"/>
+          </w:tcPr>
+          <w:p>
+            <w:pPr>
+              <w:spacing w:line="288" w:lineRule="auto" w:after="40" w:before="40"/>
+              <w:ind w:firstLine="0"/>
+              <w:jc w:val="left"/>
+            </w:pPr>
+            <w:r>
+              <w:rPr>
+                <w:rFonts w:ascii="宋体" w:hAnsi="宋体" w:eastAsia="宋体"/>
+                <w:b w:val="0"/>
+                <w:color w:val="000000"/>
+                <w:sz w:val="21"/>
+              </w:rPr>
+              <w:t>待完成</w:t>
+            </w:r>
+          </w:p>
+        </w:tc>
+        <w:tc>
+          <w:tcPr>
+            <w:tcW w:type="dxa" w:w="3912"/>
+            <w:vAlign w:val="center"/>
+          </w:tcPr>
+          <w:p>
+            <w:pPr>
+              <w:spacing w:line="288" w:lineRule="auto" w:after="40" w:before="40"/>
+              <w:ind w:firstLine="0"/>
+              <w:jc w:val="left"/>
+            </w:pPr>
+            <w:r>
+              <w:rPr>
+                <w:rFonts w:ascii="宋体" w:hAnsi="宋体" w:eastAsia="宋体"/>
+                <w:b w:val="0"/>
+                <w:color w:val="000000"/>
+                <w:sz w:val="21"/>
+              </w:rPr>
+              <w:t>当前通过测试适配器验证C事务，不代表B正式实现</w:t>
+            </w:r>
+          </w:p>
+        </w:tc>
+      </w:tr>
+      <w:tr>
+        <w:trPr>
+          <w:cantSplit/>
+        </w:trPr>
+        <w:tc>
+          <w:tcPr>
+            <w:tcW w:type="dxa" w:w="1984"/>
+            <w:vAlign w:val="center"/>
+          </w:tcPr>
+          <w:p>
+            <w:pPr>
+              <w:spacing w:line="288" w:lineRule="auto" w:after="40" w:before="40"/>
+              <w:ind w:firstLine="0"/>
+              <w:jc w:val="center"/>
+            </w:pPr>
+            <w:r>
+              <w:rPr>
+                <w:rFonts w:ascii="宋体" w:hAnsi="宋体" w:eastAsia="宋体"/>
+                <w:b w:val="0"/>
+                <w:color w:val="000000"/>
+                <w:sz w:val="21"/>
+              </w:rPr>
+              <w:t>C原生页面与真机</w:t>
+            </w:r>
+          </w:p>
+        </w:tc>
+        <w:tc>
+          <w:tcPr>
+            <w:tcW w:type="dxa" w:w="3175"/>
+            <w:vAlign w:val="center"/>
+          </w:tcPr>
+          <w:p>
+            <w:pPr>
+              <w:spacing w:line="288" w:lineRule="auto" w:after="40" w:before="40"/>
+              <w:ind w:firstLine="0"/>
+              <w:jc w:val="left"/>
+            </w:pPr>
+            <w:r>
+              <w:rPr>
+                <w:rFonts w:ascii="宋体" w:hAnsi="宋体" w:eastAsia="宋体"/>
+                <w:b w:val="0"/>
+                <w:color w:val="000000"/>
+                <w:sz w:val="21"/>
+              </w:rPr>
+              <w:t>待完成</w:t>
+            </w:r>
+          </w:p>
+        </w:tc>
+        <w:tc>
+          <w:tcPr>
+            <w:tcW w:type="dxa" w:w="3912"/>
+            <w:vAlign w:val="center"/>
+          </w:tcPr>
+          <w:p>
+            <w:pPr>
+              <w:spacing w:line="288" w:lineRule="auto" w:after="40" w:before="40"/>
+              <w:ind w:firstLine="0"/>
+              <w:jc w:val="left"/>
+            </w:pPr>
+            <w:r>
+              <w:rPr>
+                <w:rFonts w:ascii="宋体" w:hAnsi="宋体" w:eastAsia="宋体"/>
+                <w:b w:val="0"/>
+                <w:color w:val="000000"/>
+                <w:sz w:val="21"/>
+              </w:rPr>
+              <w:t>未将静态检查或代码说明图当作截图验收</w:t>
+            </w:r>
+          </w:p>
+        </w:tc>
+      </w:tr>
+      <w:tr>
+        <w:trPr>
+          <w:cantSplit/>
+        </w:trPr>
+        <w:tc>
+          <w:tcPr>
+            <w:tcW w:type="dxa" w:w="1984"/>
+            <w:vAlign w:val="center"/>
+          </w:tcPr>
+          <w:p>
+            <w:pPr>
+              <w:spacing w:line="288" w:lineRule="auto" w:after="40" w:before="40"/>
+              <w:ind w:firstLine="0"/>
+              <w:jc w:val="center"/>
+            </w:pPr>
+            <w:r>
+              <w:rPr>
+                <w:rFonts w:ascii="宋体" w:hAnsi="宋体" w:eastAsia="宋体"/>
+                <w:b w:val="0"/>
+                <w:color w:val="000000"/>
+                <w:sz w:val="21"/>
+              </w:rPr>
+              <w:t>远端CI及同伴复核</w:t>
+            </w:r>
+          </w:p>
+        </w:tc>
+        <w:tc>
+          <w:tcPr>
+            <w:tcW w:type="dxa" w:w="3175"/>
+            <w:vAlign w:val="center"/>
+          </w:tcPr>
+          <w:p>
+            <w:pPr>
+              <w:spacing w:line="288" w:lineRule="auto" w:after="40" w:before="40"/>
+              <w:ind w:firstLine="0"/>
+              <w:jc w:val="left"/>
+            </w:pPr>
+            <w:r>
+              <w:rPr>
+                <w:rFonts w:ascii="宋体" w:hAnsi="宋体" w:eastAsia="宋体"/>
+                <w:b w:val="0"/>
+                <w:color w:val="000000"/>
+                <w:sz w:val="21"/>
+              </w:rPr>
+              <w:t>待完成</w:t>
+            </w:r>
+          </w:p>
+        </w:tc>
+        <w:tc>
+          <w:tcPr>
+            <w:tcW w:type="dxa" w:w="3912"/>
+            <w:vAlign w:val="center"/>
+          </w:tcPr>
+          <w:p>
+            <w:pPr>
+              <w:spacing w:line="288" w:lineRule="auto" w:after="40" w:before="40"/>
+              <w:ind w:firstLine="0"/>
+              <w:jc w:val="left"/>
+            </w:pPr>
+            <w:r>
+              <w:rPr>
+                <w:rFonts w:ascii="宋体" w:hAnsi="宋体" w:eastAsia="宋体"/>
+                <w:b w:val="0"/>
+                <w:color w:val="000000"/>
+                <w:sz w:val="21"/>
+              </w:rPr>
+              <w:t>C本地分支尚未推送或创建PR</w:t>
+            </w:r>
+          </w:p>
+        </w:tc>
+      </w:tr>
+    </w:tbl>
+    <w:p>
+      <w:pPr/>
+      <w:r>
+        <w:t>安全和并发测试覆盖陌生人读取消息、管理员越权进入参与者接口、重复消息、同键不同正文、50条分页、bigint游标、举报人隔离、相关凭证授权、冻结绕过及账号恢复。事务专项验证并发成立只成功一次、信誉服务报错回滚，以及扣分后商品状态校验失败时账本和分数一并回滚。</w:t>
+      </w:r>
+    </w:p>
+    <w:p>
+      <w:pPr/>
+      <w:r>
+        <w:t>标准命令为npm run check、npm run build、npm test、npm run test:integration及npm run test:performance，通过仓库scripts/npm.ps1执行。测试信誉账本仅在测试库创建并在结束后删除，不进入生产迁移。详细记录见docs/member-c-test-report.md；性能数据只代表本机接口及当前样本规模。</w:t>
+      </w:r>
+    </w:p>
+    <w:p>
+      <w:pPr>
+        <w:pStyle w:val="1"/>
+        <w:pageBreakBefore/>
+      </w:pPr>
+      <w:r>
+        <w:t>十四 B模块接入与后续验收</w:t>
+      </w:r>
+    </w:p>
+    <w:p>
+      <w:pPr/>
+      <w:r>
+        <w:t>C通过server/moderation/credit.ts适配B服务，沿用CreditService.applyEvent方法，参数为当前事务连接及用户、事件、来源和分值。C侧约定导出路径为server/credit/service.ts，事件为REPORT_UPHELD，sourceId为举报ID字符串，delta取CREDIT_RULES.report，当前为负5。新增路径和事件名称待B核对，C不直接修改信誉分。</w:t>
+      </w:r>
+    </w:p>
+    <w:p>
+      <w:pPr/>
+      <w:r>
+        <w:t>B的信誉表须以事件类型、来源ID和用户ID建立唯一约束，重复事件不重复计分，并将分数限制在0至100。服务必须复用调用方连接，不另行提交或释放连接。当前未找到B服务时返回CREDIT_SERVICE_UNAVAILABLE，使成立举报整笔回滚；这项失败保护已经验证，正式信誉接入仍待B实现。</w:t>
+      </w:r>
+    </w:p>
+    <w:p>
+      <w:pPr/>
+      <w:r>
+        <w:t>订单创建须同时检查商品上架、监管冻结标志和双方资格。取消或退款后恢复商品前，B必须重新读取moderation_frozen及卖家状态；冻结时保持不可售，卖家禁用时不能恢复可售，退款未成功前不能释放交易锁。不能仅凭status不为FROZEN判断商品未被冻结。</w:t>
+      </w:r>
+    </w:p>
+    <w:p>
+      <w:pPr/>
+      <w:r>
+        <w:t>双方继续在同一仓库的feature/orders-credit和feature/chat-reports开发。A的PR先经组员复核合入main；一方功能合入后，另一方合并最新main再联调。提前联调可建integration/b-c整合双方分支。公共路由、页面入口、OpenAPI和迁移的合并点已列于docs/handoff/c-to-b.md。</w:t>
+      </w:r>
+    </w:p>
+    <w:p>
+      <w:pPr/>
+      <w:r>
+        <w:t>后续验收需使用B正式信誉服务验证成立举报只扣一次分、异常完整回滚，以及待付款、已付款和退款中的冻结保护；再补C新页面原生截图、真机测试和咨询到交易评价再到举报的全组排练。验收通过后才能将任务C-05与C-07勾选完成，原始需求和设计说明书保持不改。</w:t>
+      </w:r>
+    </w:p>
+    <w:p>
+      <w:pPr>
+        <w:pStyle w:val="1"/>
+        <w:pageBreakBefore/>
+      </w:pPr>
+      <w:r>
         <w:rPr>
           <w:rFonts w:ascii="宋体" w:hAnsi="宋体" w:eastAsia="宋体" w:cs="宋体"/>
           <w:color w:val="000000"/>
         </w:rPr>
-        <w:t>附录 课堂展示与PPT素材索引</w:t>
+        <w:t>附录一 A阶段课堂展示与PPT素材索引</w:t>
       </w:r>
     </w:p>
     <w:p>
@@ -4755,6 +6650,428 @@
           <w:color w:val="000000"/>
         </w:rPr>
         <w:t>依据：原需求分析、设计说明书，以及仓库实现、接口、测试和截图。代码基线c16e38e，本次补充报告和素材。原始交接DOCX保持原样。</w:t>
+      </w:r>
+    </w:p>
+    <w:p>
+      <w:pPr>
+        <w:pStyle w:val="1"/>
+        <w:pageBreakBefore/>
+      </w:pPr>
+      <w:r>
+        <w:t>附录二 C模块课堂展示与素材索引</w:t>
+      </w:r>
+    </w:p>
+    <w:p>
+      <w:pPr/>
+      <w:r>
+        <w:t>C部分建议讲解4至5分钟，先展示咨询、收藏和举报的真实接口与页面入口，再说明监管事务和B接入边界。图3-5与图3-6按代码绘制，可直接用于PPT；新增页面原生截图待人工验收后补入，不以说明图代替页面截图。</w:t>
+      </w:r>
+    </w:p>
+    <w:p>
+      <w:pPr>
+        <w:pStyle w:val="af7"/>
+        <w:keepNext/>
+      </w:pPr>
+      <w:r>
+        <w:t>表3-10 C模块展示安排</w:t>
+      </w:r>
+    </w:p>
+    <w:tbl>
+      <w:tblPr>
+        <w:tblW w:type="auto" w:w="0"/>
+        <w:jc w:val="center"/>
+        <w:tblLayout w:type="fixed"/>
+        <w:tblLook w:firstColumn="1" w:firstRow="1" w:lastColumn="0" w:lastRow="0" w:noHBand="0" w:noVBand="1" w:val="04A0"/>
+        <w:tblBorders>
+          <w:top w:val="single" w:sz="4" w:color="D9D9D9"/>
+          <w:left w:val="single" w:sz="4" w:color="D9D9D9"/>
+          <w:bottom w:val="single" w:sz="4" w:color="D9D9D9"/>
+          <w:right w:val="single" w:sz="4" w:color="D9D9D9"/>
+          <w:insideH w:val="single" w:sz="4" w:color="D9D9D9"/>
+          <w:insideV w:val="single" w:sz="4" w:color="D9D9D9"/>
+        </w:tblBorders>
+        <w:tblCellMar>
+          <w:top w:w="90" w:type="dxa"/>
+          <w:bottom w:w="90" w:type="dxa"/>
+          <w:left w:w="90" w:type="dxa"/>
+          <w:right w:w="90" w:type="dxa"/>
+        </w:tblCellMar>
+      </w:tblPr>
+      <w:tblGrid>
+        <w:gridCol w:w="1984"/>
+        <w:gridCol w:w="3175"/>
+        <w:gridCol w:w="3912"/>
+      </w:tblGrid>
+      <w:tr>
+        <w:trPr>
+          <w:cantSplit/>
+          <w:tblHeader/>
+        </w:trPr>
+        <w:tc>
+          <w:tcPr>
+            <w:tcW w:type="dxa" w:w="1984"/>
+            <w:vAlign w:val="center"/>
+            <w:shd w:fill="F2F2F2"/>
+          </w:tcPr>
+          <w:p>
+            <w:pPr>
+              <w:spacing w:line="288" w:lineRule="auto" w:after="40" w:before="40"/>
+              <w:ind w:firstLine="0"/>
+              <w:jc w:val="center"/>
+            </w:pPr>
+            <w:r>
+              <w:rPr>
+                <w:rFonts w:ascii="宋体" w:hAnsi="宋体" w:eastAsia="宋体"/>
+                <w:b/>
+                <w:color w:val="000000"/>
+                <w:sz w:val="21"/>
+              </w:rPr>
+              <w:t>展示主题</w:t>
+            </w:r>
+          </w:p>
+        </w:tc>
+        <w:tc>
+          <w:tcPr>
+            <w:tcW w:type="dxa" w:w="3175"/>
+            <w:vAlign w:val="center"/>
+            <w:shd w:fill="F2F2F2"/>
+          </w:tcPr>
+          <w:p>
+            <w:pPr>
+              <w:spacing w:line="288" w:lineRule="auto" w:after="40" w:before="40"/>
+              <w:ind w:firstLine="0"/>
+              <w:jc w:val="center"/>
+            </w:pPr>
+            <w:r>
+              <w:rPr>
+                <w:rFonts w:ascii="宋体" w:hAnsi="宋体" w:eastAsia="宋体"/>
+                <w:b/>
+                <w:color w:val="000000"/>
+                <w:sz w:val="21"/>
+              </w:rPr>
+              <w:t>素材或操作入口</w:t>
+            </w:r>
+          </w:p>
+        </w:tc>
+        <w:tc>
+          <w:tcPr>
+            <w:tcW w:type="dxa" w:w="3912"/>
+            <w:vAlign w:val="center"/>
+            <w:shd w:fill="F2F2F2"/>
+          </w:tcPr>
+          <w:p>
+            <w:pPr>
+              <w:spacing w:line="288" w:lineRule="auto" w:after="40" w:before="40"/>
+              <w:ind w:firstLine="0"/>
+              <w:jc w:val="center"/>
+            </w:pPr>
+            <w:r>
+              <w:rPr>
+                <w:rFonts w:ascii="宋体" w:hAnsi="宋体" w:eastAsia="宋体"/>
+                <w:b/>
+                <w:color w:val="000000"/>
+                <w:sz w:val="21"/>
+              </w:rPr>
+              <w:t>建议讲解内容</w:t>
+            </w:r>
+          </w:p>
+        </w:tc>
+      </w:tr>
+      <w:tr>
+        <w:trPr>
+          <w:cantSplit/>
+        </w:trPr>
+        <w:tc>
+          <w:tcPr>
+            <w:tcW w:type="dxa" w:w="1984"/>
+            <w:vAlign w:val="center"/>
+          </w:tcPr>
+          <w:p>
+            <w:pPr>
+              <w:spacing w:line="288" w:lineRule="auto" w:after="40" w:before="40"/>
+              <w:ind w:firstLine="0"/>
+              <w:jc w:val="center"/>
+            </w:pPr>
+            <w:r>
+              <w:rPr>
+                <w:rFonts w:ascii="宋体" w:hAnsi="宋体" w:eastAsia="宋体"/>
+                <w:b w:val="0"/>
+                <w:color w:val="000000"/>
+                <w:sz w:val="21"/>
+              </w:rPr>
+              <w:t>咨询与消息留存</w:t>
+            </w:r>
+          </w:p>
+        </w:tc>
+        <w:tc>
+          <w:tcPr>
+            <w:tcW w:type="dxa" w:w="3175"/>
+            <w:vAlign w:val="center"/>
+          </w:tcPr>
+          <w:p>
+            <w:pPr>
+              <w:spacing w:line="288" w:lineRule="auto" w:after="40" w:before="40"/>
+              <w:ind w:firstLine="0"/>
+              <w:jc w:val="left"/>
+            </w:pPr>
+            <w:r>
+              <w:rPr>
+                <w:rFonts w:ascii="宋体" w:hAnsi="宋体" w:eastAsia="宋体"/>
+                <w:b w:val="0"/>
+                <w:color w:val="000000"/>
+                <w:sz w:val="21"/>
+              </w:rPr>
+              <w:t>07-c-chat-flow.png 以及我的咨询</w:t>
+            </w:r>
+          </w:p>
+        </w:tc>
+        <w:tc>
+          <w:tcPr>
+            <w:tcW w:type="dxa" w:w="3912"/>
+            <w:vAlign w:val="center"/>
+          </w:tcPr>
+          <w:p>
+            <w:pPr>
+              <w:spacing w:line="288" w:lineRule="auto" w:after="40" w:before="40"/>
+              <w:ind w:firstLine="0"/>
+              <w:jc w:val="left"/>
+            </w:pPr>
+            <w:r>
+              <w:rPr>
+                <w:rFonts w:ascii="宋体" w:hAnsi="宋体" w:eastAsia="宋体"/>
+                <w:b w:val="0"/>
+                <w:color w:val="000000"/>
+                <w:sz w:val="21"/>
+              </w:rPr>
+              <w:t>参与者隔离、消息幂等、3秒轮询和退出停止</w:t>
+            </w:r>
+          </w:p>
+        </w:tc>
+      </w:tr>
+      <w:tr>
+        <w:trPr>
+          <w:cantSplit/>
+        </w:trPr>
+        <w:tc>
+          <w:tcPr>
+            <w:tcW w:type="dxa" w:w="1984"/>
+            <w:vAlign w:val="center"/>
+          </w:tcPr>
+          <w:p>
+            <w:pPr>
+              <w:spacing w:line="288" w:lineRule="auto" w:after="40" w:before="40"/>
+              <w:ind w:firstLine="0"/>
+              <w:jc w:val="center"/>
+            </w:pPr>
+            <w:r>
+              <w:rPr>
+                <w:rFonts w:ascii="宋体" w:hAnsi="宋体" w:eastAsia="宋体"/>
+                <w:b w:val="0"/>
+                <w:color w:val="000000"/>
+                <w:sz w:val="21"/>
+              </w:rPr>
+              <w:t>收藏与举报</w:t>
+            </w:r>
+          </w:p>
+        </w:tc>
+        <w:tc>
+          <w:tcPr>
+            <w:tcW w:type="dxa" w:w="3175"/>
+            <w:vAlign w:val="center"/>
+          </w:tcPr>
+          <w:p>
+            <w:pPr>
+              <w:spacing w:line="288" w:lineRule="auto" w:after="40" w:before="40"/>
+              <w:ind w:firstLine="0"/>
+              <w:jc w:val="left"/>
+            </w:pPr>
+            <w:r>
+              <w:rPr>
+                <w:rFonts w:ascii="宋体" w:hAnsi="宋体" w:eastAsia="宋体"/>
+                <w:b w:val="0"/>
+                <w:color w:val="000000"/>
+                <w:sz w:val="21"/>
+              </w:rPr>
+              <w:t>商品详情与我的互动</w:t>
+            </w:r>
+          </w:p>
+        </w:tc>
+        <w:tc>
+          <w:tcPr>
+            <w:tcW w:type="dxa" w:w="3912"/>
+            <w:vAlign w:val="center"/>
+          </w:tcPr>
+          <w:p>
+            <w:pPr>
+              <w:spacing w:line="288" w:lineRule="auto" w:after="40" w:before="40"/>
+              <w:ind w:firstLine="0"/>
+              <w:jc w:val="left"/>
+            </w:pPr>
+            <w:r>
+              <w:rPr>
+                <w:rFonts w:ascii="宋体" w:hAnsi="宋体" w:eastAsia="宋体"/>
+                <w:b w:val="0"/>
+                <w:color w:val="000000"/>
+                <w:sz w:val="21"/>
+              </w:rPr>
+              <w:t>收藏失效标记、本人举报和处理结果</w:t>
+            </w:r>
+          </w:p>
+        </w:tc>
+      </w:tr>
+      <w:tr>
+        <w:trPr>
+          <w:cantSplit/>
+        </w:trPr>
+        <w:tc>
+          <w:tcPr>
+            <w:tcW w:type="dxa" w:w="1984"/>
+            <w:vAlign w:val="center"/>
+          </w:tcPr>
+          <w:p>
+            <w:pPr>
+              <w:spacing w:line="288" w:lineRule="auto" w:after="40" w:before="40"/>
+              <w:ind w:firstLine="0"/>
+              <w:jc w:val="center"/>
+            </w:pPr>
+            <w:r>
+              <w:rPr>
+                <w:rFonts w:ascii="宋体" w:hAnsi="宋体" w:eastAsia="宋体"/>
+                <w:b w:val="0"/>
+                <w:color w:val="000000"/>
+                <w:sz w:val="21"/>
+              </w:rPr>
+              <w:t>举报与监管事务</w:t>
+            </w:r>
+          </w:p>
+        </w:tc>
+        <w:tc>
+          <w:tcPr>
+            <w:tcW w:type="dxa" w:w="3175"/>
+            <w:vAlign w:val="center"/>
+          </w:tcPr>
+          <w:p>
+            <w:pPr>
+              <w:spacing w:line="288" w:lineRule="auto" w:after="40" w:before="40"/>
+              <w:ind w:firstLine="0"/>
+              <w:jc w:val="left"/>
+            </w:pPr>
+            <w:r>
+              <w:rPr>
+                <w:rFonts w:ascii="宋体" w:hAnsi="宋体" w:eastAsia="宋体"/>
+                <w:b w:val="0"/>
+                <w:color w:val="000000"/>
+                <w:sz w:val="21"/>
+              </w:rPr>
+              <w:t>08-c-report-flow.png 以及监管工作台</w:t>
+            </w:r>
+          </w:p>
+        </w:tc>
+        <w:tc>
+          <w:tcPr>
+            <w:tcW w:type="dxa" w:w="3912"/>
+            <w:vAlign w:val="center"/>
+          </w:tcPr>
+          <w:p>
+            <w:pPr>
+              <w:spacing w:line="288" w:lineRule="auto" w:after="40" w:before="40"/>
+              <w:ind w:firstLine="0"/>
+              <w:jc w:val="left"/>
+            </w:pPr>
+            <w:r>
+              <w:rPr>
+                <w:rFonts w:ascii="宋体" w:hAnsi="宋体" w:eastAsia="宋体"/>
+                <w:b w:val="0"/>
+                <w:color w:val="000000"/>
+                <w:sz w:val="21"/>
+              </w:rPr>
+              <w:t>相关凭证授权、冻结保护、重复处理和失败回滚</w:t>
+            </w:r>
+          </w:p>
+        </w:tc>
+      </w:tr>
+      <w:tr>
+        <w:trPr>
+          <w:cantSplit/>
+        </w:trPr>
+        <w:tc>
+          <w:tcPr>
+            <w:tcW w:type="dxa" w:w="1984"/>
+            <w:vAlign w:val="center"/>
+          </w:tcPr>
+          <w:p>
+            <w:pPr>
+              <w:spacing w:line="288" w:lineRule="auto" w:after="40" w:before="40"/>
+              <w:ind w:firstLine="0"/>
+              <w:jc w:val="center"/>
+            </w:pPr>
+            <w:r>
+              <w:rPr>
+                <w:rFonts w:ascii="宋体" w:hAnsi="宋体" w:eastAsia="宋体"/>
+                <w:b w:val="0"/>
+                <w:color w:val="000000"/>
+                <w:sz w:val="21"/>
+              </w:rPr>
+              <w:t>验证与B交接</w:t>
+            </w:r>
+          </w:p>
+        </w:tc>
+        <w:tc>
+          <w:tcPr>
+            <w:tcW w:type="dxa" w:w="3175"/>
+            <w:vAlign w:val="center"/>
+          </w:tcPr>
+          <w:p>
+            <w:pPr>
+              <w:spacing w:line="288" w:lineRule="auto" w:after="40" w:before="40"/>
+              <w:ind w:firstLine="0"/>
+              <w:jc w:val="left"/>
+            </w:pPr>
+            <w:r>
+              <w:rPr>
+                <w:rFonts w:ascii="宋体" w:hAnsi="宋体" w:eastAsia="宋体"/>
+                <w:b w:val="0"/>
+                <w:color w:val="000000"/>
+                <w:sz w:val="21"/>
+              </w:rPr>
+              <w:t>表3-9 与c-to-b.md</w:t>
+            </w:r>
+          </w:p>
+        </w:tc>
+        <w:tc>
+          <w:tcPr>
+            <w:tcW w:type="dxa" w:w="3912"/>
+            <w:vAlign w:val="center"/>
+          </w:tcPr>
+          <w:p>
+            <w:pPr>
+              <w:spacing w:line="288" w:lineRule="auto" w:after="40" w:before="40"/>
+              <w:ind w:firstLine="0"/>
+              <w:jc w:val="left"/>
+            </w:pPr>
+            <w:r>
+              <w:rPr>
+                <w:rFonts w:ascii="宋体" w:hAnsi="宋体" w:eastAsia="宋体"/>
+                <w:b w:val="0"/>
+                <w:color w:val="000000"/>
+                <w:sz w:val="21"/>
+              </w:rPr>
+              <w:t>20项、20组；正式信誉与订单冻结保护待联调</w:t>
+            </w:r>
+          </w:p>
+        </w:tc>
+      </w:tr>
+    </w:tbl>
+    <w:p>
+      <w:pPr/>
+      <w:r>
+        <w:t>演示口径示例：我们在A的工程上补齐站内咨询、收藏和举报监管。会话按参与者隔离，重试消息依靠唯一键保留一次。成立举报、违规处置和信誉事件共用事务，异常全部回滚；冻结标志独立于订单锁。当前C自动化验证已通过，B正式信誉接入和新页面原生验收仍待完成。</w:t>
+      </w:r>
+    </w:p>
+    <w:p>
+      <w:pPr/>
+      <w:r>
+        <w:t>素材来源：07与08依据C代码提交6112353生成，验证日期为2026年10月29日；不包含用户真实身份、令牌或密码。01至06仍为A阶段的原截图和说明图，其来源、哈希及验收日期保留。新增素材登记于ppt-assets/provenance.json，便于后续全组报告合并。</w:t>
       </w:r>
     </w:p>
     <w:sectPr>

</xml_diff>